<commit_message>
fix(badges): resolve symlinked README and testing doc to the real file so the write and the export scope agree [skip-ci]
</commit_message>
<xml_diff>
--- a/docs/scripts/compute-badges.docx
+++ b/docs/scripts/compute-badges.docx
@@ -26,7 +26,7 @@
         <w:t xml:space="preserve"> </w:t>
       </w:r>
       <w:r>
-        <w:t xml:space="preserve">2</w:t>
+        <w:t xml:space="preserve">3</w:t>
       </w:r>
       <w:r>
         <w:t xml:space="preserve"> </w:t>
@@ -42,7 +42,7 @@
         <w:t xml:space="preserve"> </w:t>
       </w:r>
       <w:r>
-        <w:t xml:space="preserve">2026-09-26T13:08:22Z</w:t>
+        <w:t xml:space="preserve">2026-09-26T14:26:37Z</w:t>
       </w:r>
       <w:r>
         <w:t xml:space="preserve"> </w:t>
@@ -1377,6 +1377,76 @@
       </w:r>
       <w:r>
         <w:t xml:space="preserve">says so. A failed export stays a loud, non-fatal warning.</w:t>
+      </w:r>
+      <w:r>
+        <w:t xml:space="preserve"> </w:t>
+      </w:r>
+      <w:r>
+        <w:t xml:space="preserve">A symlinked</w:t>
+      </w:r>
+      <w:r>
+        <w:t xml:space="preserve"> </w:t>
+      </w:r>
+      <w:r>
+        <w:rPr>
+          <w:rStyle w:val="VerbatimChar"/>
+        </w:rPr>
+        <w:t xml:space="preserve">README</w:t>
+      </w:r>
+      <w:r>
+        <w:t xml:space="preserve">/</w:t>
+      </w:r>
+      <w:r>
+        <w:rPr>
+          <w:rStyle w:val="VerbatimChar"/>
+        </w:rPr>
+        <w:t xml:space="preserve">TESTING_MD</w:t>
+      </w:r>
+      <w:r>
+        <w:t xml:space="preserve"> </w:t>
+      </w:r>
+      <w:r>
+        <w:t xml:space="preserve">is written</w:t>
+      </w:r>
+      <w:r>
+        <w:t xml:space="preserve"> </w:t>
+      </w:r>
+      <w:r>
+        <w:rPr>
+          <w:b/>
+          <w:bCs/>
+        </w:rPr>
+        <w:t xml:space="preserve">through</w:t>
+      </w:r>
+      <w:r>
+        <w:t xml:space="preserve"> </w:t>
+      </w:r>
+      <w:r>
+        <w:t xml:space="preserve">the link at its real</w:t>
+      </w:r>
+      <w:r>
+        <w:t xml:space="preserve"> </w:t>
+      </w:r>
+      <w:r>
+        <w:t xml:space="preserve">target (never replaced by a regular file), and its export is skipped when that</w:t>
+      </w:r>
+      <w:r>
+        <w:t xml:space="preserve"> </w:t>
+      </w:r>
+      <w:r>
+        <w:t xml:space="preserve">real target lies outside the repository (guard:</w:t>
+      </w:r>
+      <w:r>
+        <w:t xml:space="preserve"> </w:t>
+      </w:r>
+      <w:r>
+        <w:rPr>
+          <w:rStyle w:val="VerbatimChar"/>
+        </w:rPr>
+        <w:t xml:space="preserve">tests/unit/test_compute_badges_realpath_scope.sh</w:t>
+      </w:r>
+      <w:r>
+        <w:t xml:space="preserve">).</w:t>
       </w:r>
     </w:p>
     <w:p>

</xml_diff>